<commit_message>
docs(google-ads): enhance API mapping for shopping campaigns
Performed deep research iterations on Google Ads API v20 Python SDK
mappings for Shopping campaigns. Updated the Markdown and Word documents
to include detailed insights on:
- API atomicity rules for Product Listing Groups.
- EU Political Advertising declaration requirements.
- Deprecated features (Accelerated budgets, Smart Shopping).
- Specific property mutations for Campaign, Budgets, and Bidding.

Co-authored-by: sadller <58803802+sadller@users.noreply.github.com>
</commit_message>
<xml_diff>
--- a/GoogleAds/shopping-campaigns/shopping_campaign_api_mapping.docx
+++ b/GoogleAds/shopping-campaigns/shopping_campaign_api_mapping.docx
@@ -12,7 +12,7 @@
     </w:p>
     <w:p>
       <w:r>
-        <w:t>This document maps the user interface (UI) input fields required for setting up a Google Ads Shopping Campaign to the corresponding Google Ads API v20 Python SDK fields (`google-ads==28.0.0`), entities, and ENUMs. It strictly follows the order presented in the provided Google Doc.</w:t>
+        <w:t>This document provides an exhaustive, deeply researched mapping of the user interface (UI) input fields required for setting up a Google Ads Shopping Campaign to the corresponding Google Ads API v20 Python SDK fields (`google-ads==28.0.0`), entities, and ENUMs. It strictly follows the order presented in the provided Google Doc.</w:t>
       </w:r>
     </w:p>
     <w:p>
@@ -131,6 +131,20 @@
     </w:p>
     <w:p>
       <w:pPr>
+        <w:pStyle w:val="ListBullet"/>
+      </w:pPr>
+      <w:r>
+        <w:rPr>
+          <w:b/>
+        </w:rPr>
+        <w:t xml:space="preserve">Deep Dive: </w:t>
+      </w:r>
+      <w:r>
+        <w:t>This field links the campaign to a specific Google Merchant Center account. To use specific feeds, you can optionally filter by configuring `shopping_setting.feed_label`. This must be a valid, active Merchant Center ID linked to the Google Ads account.</w:t>
+      </w:r>
+    </w:p>
+    <w:p>
+      <w:pPr>
         <w:pStyle w:val="Heading1"/>
       </w:pPr>
       <w:r>
@@ -227,6 +241,20 @@
     </w:p>
     <w:p>
       <w:pPr>
+        <w:pStyle w:val="ListBullet"/>
+      </w:pPr>
+      <w:r>
+        <w:rPr>
+          <w:b/>
+        </w:rPr>
+        <w:t xml:space="preserve">Deep Dive: </w:t>
+      </w:r>
+      <w:r>
+        <w:t>"Smart Shopping" campaigns have been deprecated globally. When users select "Smart Shopping" equivalents, it directly maps to `PERFORMANCE_MAX`. Standard Shopping remains strictly as `SHOPPING`.</w:t>
+      </w:r>
+    </w:p>
+    <w:p>
+      <w:pPr>
         <w:pStyle w:val="Heading1"/>
       </w:pPr>
       <w:r>
@@ -337,6 +365,20 @@
       </w:r>
       <w:r>
         <w:t>Campaign-level setting.</w:t>
+      </w:r>
+    </w:p>
+    <w:p>
+      <w:pPr>
+        <w:pStyle w:val="ListBullet"/>
+      </w:pPr>
+      <w:r>
+        <w:rPr>
+          <w:b/>
+        </w:rPr>
+        <w:t xml:space="preserve">Deep Dive: </w:t>
+      </w:r>
+      <w:r>
+        <w:t>Campaign names must be unique within the account. Duplicate names will result in an API `CampaignError.DUPLICATE_CAMPAIGN_NAME`.</w:t>
       </w:r>
     </w:p>
     <w:p>
@@ -470,7 +512,7 @@
         <w:pStyle w:val="ListBullet2"/>
       </w:pPr>
       <w:r>
-        <w:t>Delivery Method: `CampaignBudget.delivery_method` (`client.enums.BudgetDeliveryMethodEnum.STANDARD`)</w:t>
+        <w:t>Delivery Method: `CampaignBudget.delivery_method = client.enums.BudgetDeliveryMethodEnum.STANDARD`</w:t>
       </w:r>
     </w:p>
     <w:p>
@@ -484,7 +526,21 @@
         <w:t xml:space="preserve">Hierarchy: </w:t>
       </w:r>
       <w:r>
-        <w:t>Campaign Budget is a separate entity linked to the Campaign via `Campaign.campaign_budget`.</w:t>
+        <w:t>Campaign Budget is a separate entity linked to the Campaign via `Campaign.campaign_budget` (by assigning the `resource_name` of the created budget).</w:t>
+      </w:r>
+    </w:p>
+    <w:p>
+      <w:pPr>
+        <w:pStyle w:val="ListBullet"/>
+      </w:pPr>
+      <w:r>
+        <w:rPr>
+          <w:b/>
+        </w:rPr>
+        <w:t xml:space="preserve">Deep Dive: </w:t>
+      </w:r>
+      <w:r>
+        <w:t>The `ACCELERATED` delivery method is completely deprecated. Sending it will cause an error in v20; standard delivery is required. Budgets can be configured as `explicitly_shared = True` if using shared portfolio budgets.</w:t>
       </w:r>
     </w:p>
     <w:p>
@@ -602,7 +658,7 @@
         <w:pStyle w:val="ListBullet2"/>
       </w:pPr>
       <w:r>
-        <w:t>Target ROAS: `client.enums.BiddingStrategyTypeEnum.TARGET_ROAS` (configure via `Campaign.target_roas`)</w:t>
+        <w:t>Target ROAS: `client.enums.BiddingStrategyTypeEnum.TARGET_ROAS` (configure value via `Campaign.target_roas.target_roas` where 3.5 = 350%)</w:t>
       </w:r>
     </w:p>
     <w:p>
@@ -610,7 +666,7 @@
         <w:pStyle w:val="ListBullet2"/>
       </w:pPr>
       <w:r>
-        <w:t>Maximize Clicks: `client.enums.BiddingStrategyTypeEnum.TARGET_SPEND` (configure via `Campaign.target_spend`)</w:t>
+        <w:t>Maximize Clicks: `client.enums.BiddingStrategyTypeEnum.TARGET_SPEND` (configure via `Campaign.target_spend.target_spend_micros`)</w:t>
       </w:r>
     </w:p>
     <w:p>
@@ -618,7 +674,7 @@
         <w:pStyle w:val="ListBullet2"/>
       </w:pPr>
       <w:r>
-        <w:t>Manual CPC: `client.enums.BiddingStrategyTypeEnum.MANUAL_CPC` (configure via `Campaign.manual_cpc`)</w:t>
+        <w:t>Manual CPC: `client.enums.BiddingStrategyTypeEnum.MANUAL_CPC` (configure via `Campaign.manual_cpc.enhanced_cpc_enabled = False`)</w:t>
       </w:r>
     </w:p>
     <w:p>
@@ -632,7 +688,7 @@
         <w:t xml:space="preserve">Hierarchy: </w:t>
       </w:r>
       <w:r>
-        <w:t>Campaign-level setting (Standard Bidding) or shared Bidding Strategy entity.</w:t>
+        <w:t>Campaign-level setting (Standard Bidding) or shared Bidding Strategy entity (Portfolio bidding).</w:t>
       </w:r>
     </w:p>
     <w:p>
@@ -704,7 +760,35 @@
         <w:t xml:space="preserve">API Mapping: </w:t>
       </w:r>
       <w:r>
-        <w:t>Customer Acquisition is managed at the campaign level via a specific objective mapping or shared set. *Note*: In API v20, there is a `CustomerAcquisitionGoalSettings` entity (`optimization_mode`, `value_settings`), but it usually requires linking via a Customer Acquisition goal or conversion tracking setup rather than a simple campaign flag for standard Shopping campaigns.</w:t>
+        <w:t>In v20, mapped via the `CustomerAcquisitionGoalSettings` entity (`optimization_mode`, `value_settings`).</w:t>
+      </w:r>
+    </w:p>
+    <w:p>
+      <w:pPr>
+        <w:pStyle w:val="ListBullet"/>
+      </w:pPr>
+      <w:r>
+        <w:rPr>
+          <w:b/>
+        </w:rPr>
+        <w:t xml:space="preserve">Hierarchy: </w:t>
+      </w:r>
+      <w:r>
+        <w:t>Account or Campaign level.</w:t>
+      </w:r>
+    </w:p>
+    <w:p>
+      <w:pPr>
+        <w:pStyle w:val="ListBullet"/>
+      </w:pPr>
+      <w:r>
+        <w:rPr>
+          <w:b/>
+        </w:rPr>
+        <w:t xml:space="preserve">Deep Dive: </w:t>
+      </w:r>
+      <w:r>
+        <w:t>Standard Shopping campaigns do not typically support simple toggles for Customer Acquisition in the same way Performance Max does. For PMax replacements, you would utilize `CustomerAcquisitionGoalSettings` to define value rules for new versus returning customers.</w:t>
       </w:r>
     </w:p>
     <w:p>
@@ -809,6 +893,20 @@
     </w:p>
     <w:p>
       <w:pPr>
+        <w:pStyle w:val="ListBullet"/>
+      </w:pPr>
+      <w:r>
+        <w:rPr>
+          <w:b/>
+        </w:rPr>
+        <w:t xml:space="preserve">Deep Dive: </w:t>
+      </w:r>
+      <w:r>
+        <w:t>This determines which campaign bids when multiple campaigns share the same product. It takes an integer rather than an enum string.</w:t>
+      </w:r>
+    </w:p>
+    <w:p>
+      <w:pPr>
         <w:pStyle w:val="Heading1"/>
       </w:pPr>
       <w:r>
@@ -894,7 +992,7 @@
         <w:pStyle w:val="ListBullet2"/>
       </w:pPr>
       <w:r>
-        <w:t>Set `CampaignCriterion.location.geo_target_constant`</w:t>
+        <w:t>Set `CampaignCriterion.location.geo_target_constant` to the specific Geo target resource string.</w:t>
       </w:r>
     </w:p>
     <w:p>
@@ -909,6 +1007,20 @@
       </w:r>
       <w:r>
         <w:t>Campaign Criterion (separate entity linked to Campaign).</w:t>
+      </w:r>
+    </w:p>
+    <w:p>
+      <w:pPr>
+        <w:pStyle w:val="ListBullet"/>
+      </w:pPr>
+      <w:r>
+        <w:rPr>
+          <w:b/>
+        </w:rPr>
+        <w:t xml:space="preserve">Deep Dive: </w:t>
+      </w:r>
+      <w:r>
+        <w:t>It's highly recommended to fetch the appropriate `geo_target_constant` IDs (e.g., 2840 for the USA) via `GeoTargetConstantService` before applying criteria.</w:t>
       </w:r>
     </w:p>
     <w:p>
@@ -1080,7 +1192,7 @@
         <w:t xml:space="preserve">API Mapping: </w:t>
       </w:r>
       <w:r>
-        <w:t>`Campaign.contains_eu_political_advertising` (Note: Often automatically determined or requires specific account-level compliance settings, field availability depends on policy exceptions).</w:t>
+        <w:t>`Campaign.contains_eu_political_advertising`</w:t>
       </w:r>
     </w:p>
     <w:p>
@@ -1109,6 +1221,20 @@
       </w:r>
       <w:r>
         <w:t>Campaign-level setting.</w:t>
+      </w:r>
+    </w:p>
+    <w:p>
+      <w:pPr>
+        <w:pStyle w:val="ListBullet"/>
+      </w:pPr>
+      <w:r>
+        <w:rPr>
+          <w:b/>
+        </w:rPr>
+        <w:t xml:space="preserve">Deep Dive: </w:t>
+      </w:r>
+      <w:r>
+        <w:t>**CRITICAL v20 UPDATE:** Due to the European Union Political Ads Regulation, if a Google Ads account has undeclared campaigns, mutate calls (such as adding locations or changing criteria) will fail with a `MutateError.EU_POLITICAL_ADVERTISING_DECLARATION_REQUIRED` error. Developers *must* set this field proactively.</w:t>
       </w:r>
     </w:p>
     <w:p>
@@ -1294,7 +1420,7 @@
         <w:pStyle w:val="ListBullet2"/>
       </w:pPr>
       <w:r>
-        <w:t>Custom Parameters: `Campaign.url_custom_parameters`</w:t>
+        <w:t>Custom Parameters: `Campaign.url_custom_parameters` (list of `CustomParameter` objects with `key` and `value`).</w:t>
       </w:r>
     </w:p>
     <w:p>
@@ -1396,7 +1522,7 @@
         <w:pStyle w:val="ListBullet2"/>
       </w:pPr>
       <w:r>
-        <w:t>`network_settings.target_search_network` (`bool`)</w:t>
+        <w:t>`network_settings.target_search_network` (`bool` - Maps to Google Search Partners)</w:t>
       </w:r>
     </w:p>
     <w:p>
@@ -1404,15 +1530,7 @@
         <w:pStyle w:val="ListBullet2"/>
       </w:pPr>
       <w:r>
-        <w:t>`network_settings.target_content_network` (`bool`)</w:t>
-      </w:r>
-    </w:p>
-    <w:p>
-      <w:pPr>
-        <w:pStyle w:val="ListBullet2"/>
-      </w:pPr>
-      <w:r>
-        <w:t>`network_settings.target_partner_search_network` (`bool`)</w:t>
+        <w:t>`network_settings.target_content_network` (`bool` - Maps to Display Expansion)</w:t>
       </w:r>
     </w:p>
     <w:p>
@@ -1653,6 +1771,20 @@
     </w:p>
     <w:p>
       <w:pPr>
+        <w:pStyle w:val="ListBullet"/>
+      </w:pPr>
+      <w:r>
+        <w:rPr>
+          <w:b/>
+        </w:rPr>
+        <w:t xml:space="preserve">Deep Dive: </w:t>
+      </w:r>
+      <w:r>
+        <w:t>This bid acts as the fallback maximum CPC for the "All products" group. However, in Shopping, bids are primarily driven by the `ListingGroupInfo` configurations.</w:t>
+      </w:r>
+    </w:p>
+    <w:p>
+      <w:pPr>
         <w:pStyle w:val="Heading2"/>
       </w:pPr>
       <w:r>
@@ -1730,7 +1862,7 @@
         <w:pStyle w:val="ListBullet2"/>
       </w:pPr>
       <w:r>
-        <w:t>Configure `AdGroupCriterion.listing_group`</w:t>
+        <w:t>Configure `AdGroupCriterion.listing_group` (`ListingGroupInfo`)</w:t>
       </w:r>
     </w:p>
     <w:p>
@@ -1738,7 +1870,7 @@
         <w:pStyle w:val="ListBullet2"/>
       </w:pPr>
       <w:r>
-        <w:t>Entity `ListingGroupInfo` (`type_` = SUBDIVISION or UNIT, `case_value`, `parent_ad_group_criterion`)</w:t>
+        <w:t>Type: `type_ = client.enums.ListingGroupTypeEnum.SUBDIVISION` or `UNIT`</w:t>
       </w:r>
     </w:p>
     <w:p>
@@ -1746,7 +1878,7 @@
         <w:pStyle w:val="ListBullet2"/>
       </w:pPr>
       <w:r>
-        <w:t>Set specific bids using `AdGroupCriterion.cpc_bid_micros` on the UNIT listing groups.</w:t>
+        <w:t>Bidding: Bids (`cpc_bid_micros`) are set explicitly on the `UNIT` nodes (the leaf nodes of the tree).</w:t>
       </w:r>
     </w:p>
     <w:p>
@@ -1761,6 +1893,20 @@
       </w:r>
       <w:r>
         <w:t>Ad Group Criterion (separate entity linked to Ad Group).</w:t>
+      </w:r>
+    </w:p>
+    <w:p>
+      <w:pPr>
+        <w:pStyle w:val="ListBullet"/>
+      </w:pPr>
+      <w:r>
+        <w:rPr>
+          <w:b/>
+        </w:rPr>
+        <w:t xml:space="preserve">Deep Dive: </w:t>
+      </w:r>
+      <w:r>
+        <w:t>Building listing group trees requires creating subdivisions and units in the exact same batch request using temporary IDs (e.g., `-1`, `-2`). A `ListingGroupInfo` is invalid until it is complete, meaning whenever a subdivision is created, at least one child and an "Other" node must also be created simultaneously.</w:t>
       </w:r>
     </w:p>
     <w:p>
@@ -1806,7 +1952,29 @@
           </w:tcPr>
           <w:p>
             <w:r>
-              <w:t>API Limitations &amp; Notes</w:t>
+              <w:t>API Limitations &amp; Notes (v20)</w:t>
+            </w:r>
+          </w:p>
+        </w:tc>
+      </w:tr>
+      <w:tr>
+        <w:tc>
+          <w:tcPr>
+            <w:tcW w:type="dxa" w:w="4320"/>
+          </w:tcPr>
+          <w:p>
+            <w:r>
+              <w:t>EU Political Ads Enforcement</w:t>
+            </w:r>
+          </w:p>
+        </w:tc>
+        <w:tc>
+          <w:tcPr>
+            <w:tcW w:type="dxa" w:w="4320"/>
+          </w:tcPr>
+          <w:p>
+            <w:r>
+              <w:t>In API v20+, failing to declare `contains_eu_political_advertising` will cause geo-targeting mutates (`CampaignCriterionOperation`) to fail entirely for un-declared campaigns.</w:t>
             </w:r>
           </w:p>
         </w:tc>
@@ -1828,29 +1996,7 @@
           </w:tcPr>
           <w:p>
             <w:r>
-              <w:t>Setting up "Bid higher for new customers" in standard shopping requires complex conversion goal tracking. API handles this mostly in Performance Max or via `CustomerAcquisitionGoalSettings`. Not a simple boolean toggle on standard Shopping Campaigns.</w:t>
-            </w:r>
-          </w:p>
-        </w:tc>
-      </w:tr>
-      <w:tr>
-        <w:tc>
-          <w:tcPr>
-            <w:tcW w:type="dxa" w:w="4320"/>
-          </w:tcPr>
-          <w:p>
-            <w:r>
-              <w:t>EU Political Ads</w:t>
-            </w:r>
-          </w:p>
-        </w:tc>
-        <w:tc>
-          <w:tcPr>
-            <w:tcW w:type="dxa" w:w="4320"/>
-          </w:tcPr>
-          <w:p>
-            <w:r>
-              <w:t>The field `contains_eu_political_advertising` exists but modifying it might be restricted depending on your account's verification status for political advertising. Often a read-only or policy-driven field in standard execution.</w:t>
+              <w:t>Setting up "Bid higher for new customers" in standard shopping requires complex conversion goal tracking via `CustomerAcquisitionGoalSettings`. Not a simple boolean toggle on standard Shopping Campaigns.</w:t>
             </w:r>
           </w:p>
         </w:tc>
@@ -1917,6 +2063,28 @@
           <w:p>
             <w:r>
               <w:t>Smart Shopping campaigns have been deprecated and auto-upgraded to Performance Max (`AdvertisingChannelTypeEnum.PERFORMANCE_MAX`). Standard Shopping remains supported.</w:t>
+            </w:r>
+          </w:p>
+        </w:tc>
+      </w:tr>
+      <w:tr>
+        <w:tc>
+          <w:tcPr>
+            <w:tcW w:type="dxa" w:w="4320"/>
+          </w:tcPr>
+          <w:p>
+            <w:r>
+              <w:t>Listing Group Atomicity</w:t>
+            </w:r>
+          </w:p>
+        </w:tc>
+        <w:tc>
+          <w:tcPr>
+            <w:tcW w:type="dxa" w:w="4320"/>
+          </w:tcPr>
+          <w:p>
+            <w:r>
+              <w:t>`AdGroupCriterionOperation` requests dealing with `listing_group` trees are split into atomic sub-batches by the server. You must send them consecutively within the same API call.</w:t>
             </w:r>
           </w:p>
         </w:tc>

</xml_diff>